<commit_message>
en/spss: fix IBE links to the English ILSA pages
- point IBE-PIB links to the English /en/data/... pages (idb-analyzer-eng,
  r-repest-eng, intsvy-eng, stata-repest-eng, PIRLS data page) instead of
  the Polish equivalents
- all external links verified (HTTP 200) and open in a new tab
</commit_message>
<xml_diff>
--- a/docs/en/spss.docx
+++ b/docs/en/spss.docx
@@ -563,7 +563,7 @@
           <w:rPr>
             <w:rStyle w:val="Hyperlink"/>
           </w:rPr>
-          <w:t xml:space="preserve">ibe.edu.pl/en/data/how-to-analyse-data</w:t>
+          <w:t xml:space="preserve">ibe.edu.pl/en/data/how-to-analyze-data-from-international-large-scale-assessments-ilsa</w:t>
         </w:r>
       </w:hyperlink>
       <w:r>
@@ -1321,7 +1321,7 @@
                 <w:rPr>
                   <w:rStyle w:val="Hyperlink"/>
                 </w:rPr>
-                <w:t xml:space="preserve">ibe.edu.pl/en/data/how-to-analyse-data/idb-analyzer</w:t>
+                <w:t xml:space="preserve">ibe.edu.pl/en/data/how-to-analyze-data-from-international-large-scale-assessments-ilsa/idb-analyzer-eng</w:t>
               </w:r>
             </w:hyperlink>
           </w:p>
@@ -2506,7 +2506,7 @@
           <w:rPr>
             <w:rStyle w:val="Hyperlink"/>
           </w:rPr>
-          <w:t xml:space="preserve">www.ibe.edu.pl/pl/dane/gdzie-znalezc-dane-i-narzedzia-badawcze/pirls-dane-z-badan</w:t>
+          <w:t xml:space="preserve">www.ibe.edu.pl/en/data/where-to-find-the-data-and-research-instruments/pirls-data-international-assessments</w:t>
         </w:r>
       </w:hyperlink>
     </w:p>
@@ -5507,7 +5507,7 @@
           <w:rPr>
             <w:rStyle w:val="Hyperlink"/>
           </w:rPr>
-          <w:t xml:space="preserve">www.ibe.edu.pl/pl/dane/gdzie-znalezc-dane-i-narzedzia-badawcze/pirls-dane-z-badan</w:t>
+          <w:t xml:space="preserve">www.ibe.edu.pl/en/data/where-to-find-the-data-and-research-instruments/pirls-data-international-assessments</w:t>
         </w:r>
       </w:hyperlink>
     </w:p>
@@ -10668,7 +10668,7 @@
           <w:rPr>
             <w:rStyle w:val="Hyperlink"/>
           </w:rPr>
-          <w:t xml:space="preserve">www.ibe.edu.pl/pl/dane</w:t>
+          <w:t xml:space="preserve">www.ibe.edu.pl/en/data</w:t>
         </w:r>
       </w:hyperlink>
     </w:p>
@@ -10926,7 +10926,7 @@
           <w:rPr>
             <w:rStyle w:val="Hyperlink"/>
           </w:rPr>
-          <w:t xml:space="preserve">ibe.edu.pl/en/data/how-to-analyse-data/idb-analyzer</w:t>
+          <w:t xml:space="preserve">ibe.edu.pl/en/data/how-to-analyze-data-from-international-large-scale-assessments-ilsa/idb-analyzer-eng</w:t>
         </w:r>
       </w:hyperlink>
     </w:p>
@@ -10993,7 +10993,7 @@
           <w:rPr>
             <w:rStyle w:val="Hyperlink"/>
           </w:rPr>
-          <w:t xml:space="preserve">ibe.edu.pl/en/data/how-to-analyse-data/rrepest</w:t>
+          <w:t xml:space="preserve">ibe.edu.pl/en/data/how-to-analyze-data-from-international-large-scale-assessments-ilsa/r-repest-eng</w:t>
         </w:r>
       </w:hyperlink>
     </w:p>
@@ -11060,7 +11060,7 @@
           <w:rPr>
             <w:rStyle w:val="Hyperlink"/>
           </w:rPr>
-          <w:t xml:space="preserve">ibe.edu.pl/en/data/how-to-analyse-data/intsvy</w:t>
+          <w:t xml:space="preserve">ibe.edu.pl/en/data/how-to-analyze-data-from-international-large-scale-assessments-ilsa/intsvy-eng</w:t>
         </w:r>
       </w:hyperlink>
     </w:p>
@@ -11104,7 +11104,7 @@
           <w:rPr>
             <w:rStyle w:val="Hyperlink"/>
           </w:rPr>
-          <w:t xml:space="preserve">ibe.edu.pl/en/data/how-to-analyse-data/stata-repest</w:t>
+          <w:t xml:space="preserve">ibe.edu.pl/en/data/how-to-analyze-data-from-international-large-scale-assessments-ilsa/stata-repest-eng</w:t>
         </w:r>
       </w:hyperlink>
     </w:p>

</xml_diff>